<commit_message>
CV updated with WebSockets
</commit_message>
<xml_diff>
--- a/Christos_Kapsalis_CV.docx
+++ b/Christos_Kapsalis_CV.docx
@@ -1,6 +1,6 @@
 
 <file path=word/document.xml><?xml version="1.0" encoding="utf-8"?>
-<w:document xmlns:o="urn:schemas-microsoft-com:office:office" xmlns:r="http://schemas.openxmlformats.org/officeDocument/2006/relationships" xmlns:v="urn:schemas-microsoft-com:vml" xmlns:w="http://schemas.openxmlformats.org/wordprocessingml/2006/main" xmlns:w10="urn:schemas-microsoft-com:office:word" xmlns:wp="http://schemas.openxmlformats.org/drawingml/2006/wordprocessingDrawing" xmlns:wps="http://schemas.microsoft.com/office/word/2010/wordprocessingShape" xmlns:wpg="http://schemas.microsoft.com/office/word/2010/wordprocessingGroup" xmlns:mc="http://schemas.openxmlformats.org/markup-compatibility/2006" xmlns:wp14="http://schemas.microsoft.com/office/word/2010/wordprocessingDrawing" xmlns:w14="http://schemas.microsoft.com/office/word/2010/wordml" mc:Ignorable="w14 wp14">
+<w:document xmlns:o="urn:schemas-microsoft-com:office:office" xmlns:r="http://schemas.openxmlformats.org/officeDocument/2006/relationships" xmlns:v="urn:schemas-microsoft-com:vml" xmlns:w="http://schemas.openxmlformats.org/wordprocessingml/2006/main" xmlns:w10="urn:schemas-microsoft-com:office:word" xmlns:wp="http://schemas.openxmlformats.org/drawingml/2006/wordprocessingDrawing" xmlns:pic="http://schemas.openxmlformats.org/drawingml/2006/picture" xmlns:wps="http://schemas.microsoft.com/office/word/2010/wordprocessingShape" xmlns:wpg="http://schemas.microsoft.com/office/word/2010/wordprocessingGroup" xmlns:mc="http://schemas.openxmlformats.org/markup-compatibility/2006" xmlns:wp14="http://schemas.microsoft.com/office/word/2010/wordprocessingDrawing" xmlns:w14="http://schemas.microsoft.com/office/word/2010/wordml" xmlns:w15="http://schemas.microsoft.com/office/word/2012/wordml" mc:Ignorable="w14 wp14 w15">
   <w:body>
     <w:p>
       <w:pPr>
@@ -9,7 +9,6 @@
         <w:jc w:val="center"/>
         <w:rPr>
           <w:rFonts w:ascii="Cambria" w:hAnsi="Cambria"/>
-          <w:b/>
           <w:b/>
           <w:bCs/>
         </w:rPr>
@@ -32,7 +31,6 @@
         <w:jc w:val="center"/>
         <w:rPr>
           <w:rFonts w:ascii="Cambria" w:hAnsi="Cambria"/>
-          <w:b/>
           <w:b/>
           <w:bCs/>
         </w:rPr>
@@ -58,7 +56,7 @@
       <w:hyperlink r:id="rId2">
         <w:r>
           <w:rPr>
-            <w:rStyle w:val="InternetLink"/>
+            <w:rStyle w:val="Hyperlink"/>
             <w:rFonts w:ascii="Cambria" w:hAnsi="Cambria"/>
             <w:i/>
             <w:color w:val="333333"/>
@@ -87,7 +85,7 @@
       <w:hyperlink r:id="rId3">
         <w:r>
           <w:rPr>
-            <w:rStyle w:val="InternetLink"/>
+            <w:rStyle w:val="Hyperlink"/>
             <w:rFonts w:ascii="Cambria" w:hAnsi="Cambria"/>
             <w:i/>
             <w:color w:val="333333"/>
@@ -108,7 +106,7 @@
       <w:hyperlink r:id="rId4">
         <w:r>
           <w:rPr>
-            <w:rStyle w:val="InternetLink"/>
+            <w:rStyle w:val="Hyperlink"/>
             <w:rFonts w:ascii="Cambria" w:hAnsi="Cambria"/>
             <w:i/>
             <w:color w:val="333333"/>
@@ -129,7 +127,7 @@
       <w:hyperlink r:id="rId5">
         <w:r>
           <w:rPr>
-            <w:rStyle w:val="InternetLink"/>
+            <w:rStyle w:val="Hyperlink"/>
             <w:rFonts w:ascii="Cambria" w:hAnsi="Cambria"/>
             <w:i/>
             <w:color w:val="333333"/>
@@ -155,27 +153,25 @@
         <w:jc w:val="left"/>
         <w:rPr>
           <w:i/>
+          <w:color w:val="333333"/>
+          <w:sz w:val="18"/>
+        </w:rPr>
+      </w:pPr>
+      <w:r>
+        <w:rPr>
           <w:i/>
           <w:color w:val="333333"/>
           <w:sz w:val="18"/>
         </w:rPr>
-      </w:pPr>
-      <w:r>
-        <w:rPr>
-          <w:i/>
-          <w:color w:val="333333"/>
-          <w:sz w:val="18"/>
-        </w:rPr>
-      </w:r>
-    </w:p>
-    <w:p>
-      <w:pPr>
-        <w:pStyle w:val="Normal"/>
-        <w:bidi w:val="0"/>
-        <w:jc w:val="left"/>
-        <w:rPr>
-          <w:rFonts w:ascii="Cambria" w:hAnsi="Cambria"/>
-          <w:b/>
+      </w:r>
+    </w:p>
+    <w:p>
+      <w:pPr>
+        <w:pStyle w:val="Normal"/>
+        <w:bidi w:val="0"/>
+        <w:jc w:val="left"/>
+        <w:rPr>
+          <w:rFonts w:ascii="Cambria" w:hAnsi="Cambria"/>
           <w:b/>
           <w:bCs/>
           <w:sz w:val="26"/>
@@ -212,15 +208,15 @@
         <mc:AlternateContent>
           <mc:Choice Requires="wps">
             <w:drawing>
-              <wp:anchor behindDoc="0" distT="0" distB="0" distL="0" distR="0" simplePos="0" locked="0" layoutInCell="0" allowOverlap="1" relativeHeight="5">
+              <wp:anchor distT="0" distB="0" distL="0" distR="0" simplePos="0" relativeHeight="5" behindDoc="0" locked="0" layoutInCell="1" allowOverlap="1">
                 <wp:simplePos x="0" y="0"/>
                 <wp:positionH relativeFrom="column">
                   <wp:posOffset>11430</wp:posOffset>
                 </wp:positionH>
                 <wp:positionV relativeFrom="paragraph">
-                  <wp:posOffset>67310</wp:posOffset>
+                  <wp:posOffset>67945</wp:posOffset>
                 </wp:positionV>
-                <wp:extent cx="6138545" cy="1270"/>
+                <wp:extent cx="6138545" cy="0"/>
                 <wp:effectExtent l="0" t="0" r="0" b="0"/>
                 <wp:wrapNone/>
                 <wp:docPr id="1" name="Shape4_5"/>
@@ -231,7 +227,7 @@
                       <wps:spPr>
                         <a:xfrm>
                           <a:off x="0" y="0"/>
-                          <a:ext cx="6138000" cy="0"/>
+                          <a:ext cx="6138720" cy="0"/>
                         </a:xfrm>
                         <a:prstGeom prst="line">
                           <a:avLst/>
@@ -257,7 +253,7 @@
           </mc:Choice>
           <mc:Fallback>
             <w:pict>
-              <v:line id="shape_0" from="0.9pt,5.3pt" to="484.15pt,5.3pt" ID="Shape4_5" stroked="t" style="position:absolute">
+              <v:line id="shape_0" from="0.9pt,5.35pt" to="484.2pt,5.35pt" stroked="t" o:allowincell="f" style="position:absolute">
                 <v:stroke color="black" joinstyle="round" endcap="flat"/>
                 <v:fill o:detectmouseclick="t" on="false"/>
                 <w10:wrap type="none"/>
@@ -518,15 +514,15 @@
         <mc:AlternateContent>
           <mc:Choice Requires="wps">
             <w:drawing>
-              <wp:anchor behindDoc="0" distT="0" distB="0" distL="0" distR="0" simplePos="0" locked="0" layoutInCell="0" allowOverlap="1" relativeHeight="9">
+              <wp:anchor distT="0" distB="0" distL="0" distR="0" simplePos="0" relativeHeight="9" behindDoc="0" locked="0" layoutInCell="1" allowOverlap="1">
                 <wp:simplePos x="0" y="0"/>
                 <wp:positionH relativeFrom="column">
                   <wp:posOffset>11430</wp:posOffset>
                 </wp:positionH>
                 <wp:positionV relativeFrom="paragraph">
-                  <wp:posOffset>114935</wp:posOffset>
+                  <wp:posOffset>115570</wp:posOffset>
                 </wp:positionV>
-                <wp:extent cx="6138545" cy="1270"/>
+                <wp:extent cx="6138545" cy="0"/>
                 <wp:effectExtent l="0" t="0" r="0" b="0"/>
                 <wp:wrapNone/>
                 <wp:docPr id="2" name="Shape4_7"/>
@@ -535,16 +531,16 @@
                     <wps:wsp>
                       <wps:cNvSpPr/>
                       <wps:spPr>
-                        <a:xfrm>
+                        <a:xfrm flipV="1">
                           <a:off x="0" y="0"/>
-                          <a:ext cx="6138000" cy="0"/>
+                          <a:ext cx="6138720" cy="0"/>
                         </a:xfrm>
                         <a:prstGeom prst="line">
                           <a:avLst/>
                         </a:prstGeom>
                         <a:ln w="0">
                           <a:solidFill>
-                            <a:srgbClr val="b2b2b2"/>
+                            <a:srgbClr val="B2B2B2"/>
                           </a:solidFill>
                         </a:ln>
                       </wps:spPr>
@@ -563,7 +559,7 @@
           </mc:Choice>
           <mc:Fallback>
             <w:pict>
-              <v:line id="shape_0" from="0.9pt,9.05pt" to="484.15pt,9.05pt" ID="Shape4_7" stroked="t" style="position:absolute">
+              <v:line id="shape_0" from="0.9pt,9.1pt" to="484.2pt,9.1pt" stroked="t" o:allowincell="f" style="position:absolute;flip:y">
                 <v:stroke color="#b2b2b2" joinstyle="round" endcap="flat"/>
                 <v:fill o:detectmouseclick="t" on="false"/>
                 <w10:wrap type="none"/>
@@ -626,15 +622,15 @@
         <mc:AlternateContent>
           <mc:Choice Requires="wps">
             <w:drawing>
-              <wp:anchor behindDoc="0" distT="0" distB="0" distL="0" distR="0" simplePos="0" locked="0" layoutInCell="0" allowOverlap="1" relativeHeight="11">
+              <wp:anchor distT="0" distB="0" distL="0" distR="0" simplePos="0" relativeHeight="11" behindDoc="0" locked="0" layoutInCell="1" allowOverlap="1">
                 <wp:simplePos x="0" y="0"/>
                 <wp:positionH relativeFrom="column">
                   <wp:posOffset>11430</wp:posOffset>
                 </wp:positionH>
                 <wp:positionV relativeFrom="paragraph">
-                  <wp:posOffset>73660</wp:posOffset>
+                  <wp:posOffset>74295</wp:posOffset>
                 </wp:positionV>
-                <wp:extent cx="6138545" cy="1270"/>
+                <wp:extent cx="6138545" cy="635"/>
                 <wp:effectExtent l="0" t="0" r="0" b="0"/>
                 <wp:wrapNone/>
                 <wp:docPr id="3" name="Shape4_9"/>
@@ -643,9 +639,9 @@
                     <wps:wsp>
                       <wps:cNvSpPr/>
                       <wps:spPr>
-                        <a:xfrm>
+                        <a:xfrm flipV="1">
                           <a:off x="0" y="0"/>
-                          <a:ext cx="6138000" cy="0"/>
+                          <a:ext cx="6138720" cy="720"/>
                         </a:xfrm>
                         <a:prstGeom prst="line">
                           <a:avLst/>
@@ -671,7 +667,7 @@
           </mc:Choice>
           <mc:Fallback>
             <w:pict>
-              <v:line id="shape_0" from="0.9pt,5.8pt" to="484.15pt,5.8pt" ID="Shape4_9" stroked="t" style="position:absolute">
+              <v:line id="shape_0" from="0.9pt,5.85pt" to="484.2pt,5.85pt" stroked="t" o:allowincell="f" style="position:absolute;flip:y">
                 <v:stroke color="black" joinstyle="round" endcap="flat"/>
                 <v:fill o:detectmouseclick="t" on="false"/>
                 <w10:wrap type="none"/>
@@ -883,7 +879,23 @@
           <w:color w:val="333333"/>
           <w:sz w:val="18"/>
         </w:rPr>
-        <w:t xml:space="preserve"> RESTful APIs, JSON, AJAX, XML, SVI</w:t>
+        <w:t xml:space="preserve"> RESTful APIs, </w:t>
+      </w:r>
+      <w:r>
+        <w:rPr>
+          <w:rFonts w:ascii="Cambria" w:hAnsi="Cambria"/>
+          <w:color w:val="333333"/>
+          <w:sz w:val="18"/>
+        </w:rPr>
+        <w:t xml:space="preserve">WebSockets, </w:t>
+      </w:r>
+      <w:r>
+        <w:rPr>
+          <w:rFonts w:ascii="Cambria" w:hAnsi="Cambria"/>
+          <w:color w:val="333333"/>
+          <w:sz w:val="18"/>
+        </w:rPr>
+        <w:t>JSON, AJAX, XML, SVI</w:t>
       </w:r>
     </w:p>
     <w:p>
@@ -995,15 +1007,15 @@
         <mc:AlternateContent>
           <mc:Choice Requires="wps">
             <w:drawing>
-              <wp:anchor behindDoc="0" distT="0" distB="0" distL="0" distR="0" simplePos="0" locked="0" layoutInCell="0" allowOverlap="1" relativeHeight="10">
+              <wp:anchor distT="0" distB="0" distL="0" distR="0" simplePos="0" relativeHeight="10" behindDoc="0" locked="0" layoutInCell="1" allowOverlap="1">
                 <wp:simplePos x="0" y="0"/>
                 <wp:positionH relativeFrom="column">
                   <wp:posOffset>11430</wp:posOffset>
                 </wp:positionH>
                 <wp:positionV relativeFrom="paragraph">
-                  <wp:posOffset>114935</wp:posOffset>
+                  <wp:posOffset>115570</wp:posOffset>
                 </wp:positionV>
-                <wp:extent cx="6138545" cy="1270"/>
+                <wp:extent cx="6138545" cy="0"/>
                 <wp:effectExtent l="0" t="0" r="0" b="0"/>
                 <wp:wrapNone/>
                 <wp:docPr id="4" name="Shape4_0"/>
@@ -1012,16 +1024,16 @@
                     <wps:wsp>
                       <wps:cNvSpPr/>
                       <wps:spPr>
-                        <a:xfrm>
+                        <a:xfrm flipV="1">
                           <a:off x="0" y="0"/>
-                          <a:ext cx="6138000" cy="0"/>
+                          <a:ext cx="6138720" cy="0"/>
                         </a:xfrm>
                         <a:prstGeom prst="line">
                           <a:avLst/>
                         </a:prstGeom>
                         <a:ln w="0">
                           <a:solidFill>
-                            <a:srgbClr val="b2b2b2"/>
+                            <a:srgbClr val="B2B2B2"/>
                           </a:solidFill>
                         </a:ln>
                       </wps:spPr>
@@ -1040,7 +1052,7 @@
           </mc:Choice>
           <mc:Fallback>
             <w:pict>
-              <v:line id="shape_0" from="0.9pt,9.05pt" to="484.15pt,9.05pt" ID="Shape4_0" stroked="t" style="position:absolute">
+              <v:line id="shape_0" from="0.9pt,9.1pt" to="484.2pt,9.1pt" stroked="t" o:allowincell="f" style="position:absolute;flip:y">
                 <v:stroke color="#b2b2b2" joinstyle="round" endcap="flat"/>
                 <v:fill o:detectmouseclick="t" on="false"/>
                 <w10:wrap type="none"/>
@@ -1075,7 +1087,6 @@
         <w:rPr>
           <w:rFonts w:ascii="Cambria" w:hAnsi="Cambria"/>
           <w:b/>
-          <w:b/>
           <w:bCs/>
         </w:rPr>
       </w:pPr>
@@ -1108,15 +1119,15 @@
         <mc:AlternateContent>
           <mc:Choice Requires="wps">
             <w:drawing>
-              <wp:anchor behindDoc="0" distT="0" distB="0" distL="0" distR="0" simplePos="0" locked="0" layoutInCell="0" allowOverlap="1" relativeHeight="6">
+              <wp:anchor distT="0" distB="0" distL="0" distR="0" simplePos="0" relativeHeight="6" behindDoc="0" locked="0" layoutInCell="1" allowOverlap="1">
                 <wp:simplePos x="0" y="0"/>
                 <wp:positionH relativeFrom="column">
                   <wp:posOffset>11430</wp:posOffset>
                 </wp:positionH>
                 <wp:positionV relativeFrom="paragraph">
-                  <wp:posOffset>114935</wp:posOffset>
+                  <wp:posOffset>115570</wp:posOffset>
                 </wp:positionV>
-                <wp:extent cx="6138545" cy="1270"/>
+                <wp:extent cx="6138545" cy="0"/>
                 <wp:effectExtent l="0" t="0" r="0" b="0"/>
                 <wp:wrapNone/>
                 <wp:docPr id="5" name="Shape4_6"/>
@@ -1125,9 +1136,9 @@
                     <wps:wsp>
                       <wps:cNvSpPr/>
                       <wps:spPr>
-                        <a:xfrm>
+                        <a:xfrm flipV="1">
                           <a:off x="0" y="0"/>
-                          <a:ext cx="6138000" cy="0"/>
+                          <a:ext cx="6138720" cy="0"/>
                         </a:xfrm>
                         <a:prstGeom prst="line">
                           <a:avLst/>
@@ -1153,7 +1164,7 @@
           </mc:Choice>
           <mc:Fallback>
             <w:pict>
-              <v:line id="shape_0" from="0.9pt,9.05pt" to="484.15pt,9.05pt" ID="Shape4_6" stroked="t" style="position:absolute">
+              <v:line id="shape_0" from="0.9pt,9.1pt" to="484.2pt,9.1pt" stroked="t" o:allowincell="f" style="position:absolute;flip:y">
                 <v:stroke color="black" joinstyle="round" endcap="flat"/>
                 <v:fill o:detectmouseclick="t" on="false"/>
                 <w10:wrap type="none"/>
@@ -1501,7 +1512,7 @@
       <w:hyperlink r:id="rId6">
         <w:r>
           <w:rPr>
-            <w:rStyle w:val="InternetLink"/>
+            <w:rStyle w:val="Hyperlink"/>
             <w:rFonts w:ascii="Cambria" w:hAnsi="Cambria"/>
             <w:i/>
             <w:color w:val="006EDD"/>
@@ -1858,7 +1869,6 @@
         <w:rPr>
           <w:rFonts w:ascii="Cambria" w:hAnsi="Cambria"/>
           <w:b/>
-          <w:b/>
           <w:bCs/>
         </w:rPr>
       </w:pPr>
@@ -1885,7 +1895,7 @@
       <w:hyperlink r:id="rId7">
         <w:r>
           <w:rPr>
-            <w:rStyle w:val="InternetLink"/>
+            <w:rStyle w:val="Hyperlink"/>
             <w:rFonts w:ascii="Cambria" w:hAnsi="Cambria"/>
             <w:i/>
             <w:color w:val="006EDD"/>
@@ -2313,7 +2323,6 @@
         <w:rPr>
           <w:rFonts w:ascii="Cambria" w:hAnsi="Cambria"/>
           <w:b/>
-          <w:b/>
           <w:bCs/>
         </w:rPr>
       </w:pPr>
@@ -2340,7 +2349,7 @@
       <w:hyperlink r:id="rId8">
         <w:r>
           <w:rPr>
-            <w:rStyle w:val="InternetLink"/>
+            <w:rStyle w:val="Hyperlink"/>
             <w:rFonts w:ascii="Cambria" w:hAnsi="Cambria"/>
             <w:i/>
             <w:color w:val="006EDD"/>
@@ -2627,7 +2636,6 @@
         <w:rPr>
           <w:rFonts w:ascii="Cambria" w:hAnsi="Cambria"/>
           <w:b/>
-          <w:b/>
           <w:bCs/>
         </w:rPr>
       </w:pPr>
@@ -2654,7 +2662,7 @@
       <w:hyperlink r:id="rId9">
         <w:r>
           <w:rPr>
-            <w:rStyle w:val="InternetLink"/>
+            <w:rStyle w:val="Hyperlink"/>
             <w:rFonts w:ascii="Cambria" w:hAnsi="Cambria"/>
             <w:i/>
             <w:color w:val="006EDD"/>
@@ -2883,7 +2891,7 @@
       <w:hyperlink r:id="rId10">
         <w:r>
           <w:rPr>
-            <w:rStyle w:val="InternetLink"/>
+            <w:rStyle w:val="Hyperlink"/>
             <w:rFonts w:ascii="Cambria" w:hAnsi="Cambria"/>
             <w:i/>
             <w:color w:val="006EDD"/>
@@ -3093,15 +3101,15 @@
         <mc:AlternateContent>
           <mc:Choice Requires="wps">
             <w:drawing>
-              <wp:anchor behindDoc="0" distT="0" distB="0" distL="0" distR="0" simplePos="0" locked="0" layoutInCell="0" allowOverlap="1" relativeHeight="8">
+              <wp:anchor distT="0" distB="0" distL="0" distR="0" simplePos="0" relativeHeight="8" behindDoc="0" locked="0" layoutInCell="1" allowOverlap="1">
                 <wp:simplePos x="0" y="0"/>
                 <wp:positionH relativeFrom="column">
                   <wp:posOffset>11430</wp:posOffset>
                 </wp:positionH>
                 <wp:positionV relativeFrom="paragraph">
-                  <wp:posOffset>114935</wp:posOffset>
+                  <wp:posOffset>115570</wp:posOffset>
                 </wp:positionV>
-                <wp:extent cx="6138545" cy="1270"/>
+                <wp:extent cx="6138545" cy="0"/>
                 <wp:effectExtent l="0" t="0" r="0" b="0"/>
                 <wp:wrapNone/>
                 <wp:docPr id="6" name="Shape4_8"/>
@@ -3110,16 +3118,16 @@
                     <wps:wsp>
                       <wps:cNvSpPr/>
                       <wps:spPr>
-                        <a:xfrm>
+                        <a:xfrm flipV="1">
                           <a:off x="0" y="0"/>
-                          <a:ext cx="6138000" cy="0"/>
+                          <a:ext cx="6138720" cy="0"/>
                         </a:xfrm>
                         <a:prstGeom prst="line">
                           <a:avLst/>
                         </a:prstGeom>
                         <a:ln w="0">
                           <a:solidFill>
-                            <a:srgbClr val="b2b2b2"/>
+                            <a:srgbClr val="B2B2B2"/>
                           </a:solidFill>
                         </a:ln>
                       </wps:spPr>
@@ -3138,7 +3146,7 @@
           </mc:Choice>
           <mc:Fallback>
             <w:pict>
-              <v:line id="shape_0" from="0.9pt,9.05pt" to="484.15pt,9.05pt" ID="Shape4_8" stroked="t" style="position:absolute">
+              <v:line id="shape_0" from="0.9pt,9.1pt" to="484.2pt,9.1pt" stroked="t" o:allowincell="f" style="position:absolute;flip:y">
                 <v:stroke color="#b2b2b2" joinstyle="round" endcap="flat"/>
                 <v:fill o:detectmouseclick="t" on="false"/>
                 <w10:wrap type="none"/>
@@ -3173,7 +3181,6 @@
         <w:rPr>
           <w:rFonts w:ascii="Cambria" w:hAnsi="Cambria"/>
           <w:b/>
-          <w:b/>
           <w:bCs/>
         </w:rPr>
       </w:pPr>
@@ -3204,15 +3211,15 @@
         <mc:AlternateContent>
           <mc:Choice Requires="wps">
             <w:drawing>
-              <wp:anchor behindDoc="0" distT="0" distB="0" distL="0" distR="0" simplePos="0" locked="0" layoutInCell="0" allowOverlap="1" relativeHeight="2">
+              <wp:anchor distT="0" distB="0" distL="0" distR="0" simplePos="0" relativeHeight="2" behindDoc="0" locked="0" layoutInCell="1" allowOverlap="1">
                 <wp:simplePos x="0" y="0"/>
                 <wp:positionH relativeFrom="column">
                   <wp:posOffset>11430</wp:posOffset>
                 </wp:positionH>
                 <wp:positionV relativeFrom="paragraph">
-                  <wp:posOffset>73660</wp:posOffset>
+                  <wp:posOffset>74295</wp:posOffset>
                 </wp:positionV>
-                <wp:extent cx="6138545" cy="1270"/>
+                <wp:extent cx="6138545" cy="635"/>
                 <wp:effectExtent l="0" t="0" r="0" b="0"/>
                 <wp:wrapNone/>
                 <wp:docPr id="7" name="Shape4_1"/>
@@ -3221,9 +3228,9 @@
                     <wps:wsp>
                       <wps:cNvSpPr/>
                       <wps:spPr>
-                        <a:xfrm>
+                        <a:xfrm flipV="1">
                           <a:off x="0" y="0"/>
-                          <a:ext cx="6138000" cy="0"/>
+                          <a:ext cx="6138720" cy="720"/>
                         </a:xfrm>
                         <a:prstGeom prst="line">
                           <a:avLst/>
@@ -3249,7 +3256,7 @@
           </mc:Choice>
           <mc:Fallback>
             <w:pict>
-              <v:line id="shape_0" from="0.9pt,5.8pt" to="484.15pt,5.8pt" ID="Shape4_1" stroked="t" style="position:absolute">
+              <v:line id="shape_0" from="0.9pt,5.85pt" to="484.2pt,5.85pt" stroked="t" o:allowincell="f" style="position:absolute;flip:y">
                 <v:stroke color="black" joinstyle="round" endcap="flat"/>
                 <v:fill o:detectmouseclick="t" on="false"/>
                 <w10:wrap type="none"/>
@@ -3291,7 +3298,7 @@
       <w:hyperlink r:id="rId11">
         <w:r>
           <w:rPr>
-            <w:rStyle w:val="InternetLink"/>
+            <w:rStyle w:val="Hyperlink"/>
             <w:rFonts w:ascii="Cambria" w:hAnsi="Cambria"/>
             <w:b/>
             <w:bCs/>
@@ -3749,7 +3756,7 @@
       <w:hyperlink r:id="rId12">
         <w:r>
           <w:rPr>
-            <w:rStyle w:val="InternetLink"/>
+            <w:rStyle w:val="Hyperlink"/>
             <w:rFonts w:ascii="Cambria" w:hAnsi="Cambria"/>
             <w:color w:val="333333"/>
             <w:sz w:val="18"/>
@@ -3869,15 +3876,15 @@
         <mc:AlternateContent>
           <mc:Choice Requires="wps">
             <w:drawing>
-              <wp:anchor behindDoc="0" distT="0" distB="0" distL="0" distR="0" simplePos="0" locked="0" layoutInCell="0" allowOverlap="1" relativeHeight="7">
+              <wp:anchor distT="0" distB="0" distL="0" distR="0" simplePos="0" relativeHeight="7" behindDoc="0" locked="0" layoutInCell="1" allowOverlap="1">
                 <wp:simplePos x="0" y="0"/>
                 <wp:positionH relativeFrom="column">
                   <wp:posOffset>11430</wp:posOffset>
                 </wp:positionH>
                 <wp:positionV relativeFrom="paragraph">
-                  <wp:posOffset>114935</wp:posOffset>
+                  <wp:posOffset>115570</wp:posOffset>
                 </wp:positionV>
-                <wp:extent cx="6138545" cy="1270"/>
+                <wp:extent cx="6138545" cy="0"/>
                 <wp:effectExtent l="0" t="0" r="0" b="0"/>
                 <wp:wrapNone/>
                 <wp:docPr id="8" name="Shape4_2"/>
@@ -3886,16 +3893,16 @@
                     <wps:wsp>
                       <wps:cNvSpPr/>
                       <wps:spPr>
-                        <a:xfrm>
+                        <a:xfrm flipV="1">
                           <a:off x="0" y="0"/>
-                          <a:ext cx="6138000" cy="0"/>
+                          <a:ext cx="6138720" cy="0"/>
                         </a:xfrm>
                         <a:prstGeom prst="line">
                           <a:avLst/>
                         </a:prstGeom>
                         <a:ln w="0">
                           <a:solidFill>
-                            <a:srgbClr val="b2b2b2"/>
+                            <a:srgbClr val="B2B2B2"/>
                           </a:solidFill>
                         </a:ln>
                       </wps:spPr>
@@ -3914,7 +3921,7 @@
           </mc:Choice>
           <mc:Fallback>
             <w:pict>
-              <v:line id="shape_0" from="0.9pt,9.05pt" to="484.15pt,9.05pt" ID="Shape4_2" stroked="t" style="position:absolute">
+              <v:line id="shape_0" from="0.9pt,9.1pt" to="484.2pt,9.1pt" stroked="t" o:allowincell="f" style="position:absolute;flip:y">
                 <v:stroke color="#b2b2b2" joinstyle="round" endcap="flat"/>
                 <v:fill o:detectmouseclick="t" on="false"/>
                 <w10:wrap type="none"/>
@@ -3949,7 +3956,6 @@
         <w:rPr>
           <w:rFonts w:ascii="Cambria" w:hAnsi="Cambria"/>
           <w:b/>
-          <w:b/>
           <w:bCs/>
         </w:rPr>
       </w:pPr>
@@ -3980,15 +3986,15 @@
         <mc:AlternateContent>
           <mc:Choice Requires="wps">
             <w:drawing>
-              <wp:anchor behindDoc="0" distT="0" distB="0" distL="0" distR="0" simplePos="0" locked="0" layoutInCell="0" allowOverlap="1" relativeHeight="4">
+              <wp:anchor distT="0" distB="0" distL="0" distR="0" simplePos="0" relativeHeight="4" behindDoc="0" locked="0" layoutInCell="1" allowOverlap="1">
                 <wp:simplePos x="0" y="0"/>
                 <wp:positionH relativeFrom="column">
                   <wp:posOffset>11430</wp:posOffset>
                 </wp:positionH>
                 <wp:positionV relativeFrom="paragraph">
-                  <wp:posOffset>60325</wp:posOffset>
+                  <wp:posOffset>60960</wp:posOffset>
                 </wp:positionV>
-                <wp:extent cx="6138545" cy="1270"/>
+                <wp:extent cx="6138545" cy="0"/>
                 <wp:effectExtent l="0" t="0" r="0" b="0"/>
                 <wp:wrapNone/>
                 <wp:docPr id="9" name="Shape4_4"/>
@@ -3999,7 +4005,7 @@
                       <wps:spPr>
                         <a:xfrm>
                           <a:off x="0" y="0"/>
-                          <a:ext cx="6138000" cy="0"/>
+                          <a:ext cx="6138720" cy="0"/>
                         </a:xfrm>
                         <a:prstGeom prst="line">
                           <a:avLst/>
@@ -4025,7 +4031,7 @@
           </mc:Choice>
           <mc:Fallback>
             <w:pict>
-              <v:line id="shape_0" from="0.9pt,4.75pt" to="484.15pt,4.75pt" ID="Shape4_4" stroked="t" style="position:absolute">
+              <v:line id="shape_0" from="0.9pt,4.8pt" to="484.2pt,4.8pt" stroked="t" o:allowincell="f" style="position:absolute">
                 <v:stroke color="black" joinstyle="round" endcap="flat"/>
                 <v:fill o:detectmouseclick="t" on="false"/>
                 <w10:wrap type="none"/>
@@ -4149,25 +4155,28 @@
         <w:jc w:val="left"/>
         <w:rPr>
           <w:i/>
+          <w:color w:val="333333"/>
+          <w:sz w:val="18"/>
+        </w:rPr>
+      </w:pPr>
+      <w:r>
+        <w:rPr>
           <w:i/>
           <w:color w:val="333333"/>
           <w:sz w:val="18"/>
         </w:rPr>
-      </w:pPr>
-      <w:r>
-        <w:rPr/>
         <mc:AlternateContent>
           <mc:Choice Requires="wps">
             <w:drawing>
-              <wp:anchor behindDoc="0" distT="0" distB="0" distL="0" distR="0" simplePos="0" locked="0" layoutInCell="0" allowOverlap="1" relativeHeight="3">
+              <wp:anchor distT="0" distB="0" distL="0" distR="0" simplePos="0" relativeHeight="3" behindDoc="0" locked="0" layoutInCell="1" allowOverlap="1">
                 <wp:simplePos x="0" y="0"/>
                 <wp:positionH relativeFrom="column">
                   <wp:posOffset>11430</wp:posOffset>
                 </wp:positionH>
                 <wp:positionV relativeFrom="paragraph">
-                  <wp:posOffset>114935</wp:posOffset>
+                  <wp:posOffset>115570</wp:posOffset>
                 </wp:positionV>
-                <wp:extent cx="6138545" cy="1270"/>
+                <wp:extent cx="6138545" cy="0"/>
                 <wp:effectExtent l="0" t="0" r="0" b="0"/>
                 <wp:wrapNone/>
                 <wp:docPr id="10" name="Shape4_3"/>
@@ -4176,16 +4185,16 @@
                     <wps:wsp>
                       <wps:cNvSpPr/>
                       <wps:spPr>
-                        <a:xfrm>
+                        <a:xfrm flipV="1">
                           <a:off x="0" y="0"/>
-                          <a:ext cx="6138000" cy="0"/>
+                          <a:ext cx="6138720" cy="0"/>
                         </a:xfrm>
                         <a:prstGeom prst="line">
                           <a:avLst/>
                         </a:prstGeom>
                         <a:ln w="0">
                           <a:solidFill>
-                            <a:srgbClr val="b2b2b2"/>
+                            <a:srgbClr val="B2B2B2"/>
                           </a:solidFill>
                         </a:ln>
                       </wps:spPr>
@@ -4204,7 +4213,7 @@
           </mc:Choice>
           <mc:Fallback>
             <w:pict>
-              <v:line id="shape_0" from="0.9pt,9.05pt" to="484.15pt,9.05pt" ID="Shape4_3" stroked="t" style="position:absolute">
+              <v:line id="shape_0" from="0.9pt,9.1pt" to="484.2pt,9.1pt" stroked="t" o:allowincell="f" style="position:absolute;flip:y">
                 <v:stroke color="#b2b2b2" joinstyle="round" endcap="flat"/>
                 <v:fill o:detectmouseclick="t" on="false"/>
                 <w10:wrap type="none"/>
@@ -4217,7 +4226,7 @@
     <w:sectPr>
       <w:type w:val="nextPage"/>
       <w:pgSz w:w="11906" w:h="16838"/>
-      <w:pgMar w:left="1134" w:right="1134" w:header="0" w:top="1134" w:footer="0" w:bottom="1134" w:gutter="0"/>
+      <w:pgMar w:left="1134" w:right="1134" w:gutter="0" w:header="0" w:top="1134" w:footer="0" w:bottom="1134"/>
       <w:pgNumType w:fmt="decimal"/>
       <w:formProt w:val="false"/>
       <w:textDirection w:val="lrTb"/>
@@ -4265,9 +4274,9 @@
     </w:rPr>
   </w:style>
   <w:style w:type="paragraph" w:styleId="Heading3">
-    <w:name w:val="Heading 3"/>
+    <w:name w:val="heading 3"/>
     <w:basedOn w:val="Heading"/>
-    <w:next w:val="TextBody"/>
+    <w:next w:val="BodyText"/>
     <w:qFormat/>
     <w:pPr>
       <w:spacing w:before="140" w:after="120"/>
@@ -4281,7 +4290,7 @@
       <w:szCs w:val="28"/>
     </w:rPr>
   </w:style>
-  <w:style w:type="character" w:styleId="InternetLink">
+  <w:style w:type="character" w:styleId="Hyperlink">
     <w:name w:val="Hyperlink"/>
     <w:rPr>
       <w:color w:val="000080"/>
@@ -4289,7 +4298,7 @@
       <w:lang w:val="zxx" w:eastAsia="zxx" w:bidi="zxx"/>
     </w:rPr>
   </w:style>
-  <w:style w:type="character" w:styleId="VisitedInternetLink">
+  <w:style w:type="character" w:styleId="FollowedHyperlink">
     <w:name w:val="FollowedHyperlink"/>
     <w:rPr>
       <w:color w:val="800000"/>
@@ -4308,7 +4317,7 @@
   <w:style w:type="paragraph" w:styleId="Heading">
     <w:name w:val="Heading"/>
     <w:basedOn w:val="Normal"/>
-    <w:next w:val="TextBody"/>
+    <w:next w:val="BodyText"/>
     <w:qFormat/>
     <w:pPr>
       <w:keepNext w:val="true"/>
@@ -4320,7 +4329,7 @@
       <w:szCs w:val="28"/>
     </w:rPr>
   </w:style>
-  <w:style w:type="paragraph" w:styleId="TextBody">
+  <w:style w:type="paragraph" w:styleId="BodyText">
     <w:name w:val="Body Text"/>
     <w:basedOn w:val="Normal"/>
     <w:pPr>
@@ -4330,14 +4339,14 @@
   </w:style>
   <w:style w:type="paragraph" w:styleId="List">
     <w:name w:val="List"/>
-    <w:basedOn w:val="TextBody"/>
+    <w:basedOn w:val="BodyText"/>
     <w:pPr/>
     <w:rPr>
       <w:rFonts w:cs="Arial"/>
     </w:rPr>
   </w:style>
   <w:style w:type="paragraph" w:styleId="Caption">
-    <w:name w:val="Caption"/>
+    <w:name w:val="caption"/>
     <w:basedOn w:val="Normal"/>
     <w:qFormat/>
     <w:pPr>
@@ -4388,4 +4397,110 @@
     </w:rPr>
   </w:style>
 </w:styles>
+</file>
+
+<file path=word/theme/theme1.xml><?xml version="1.0" encoding="utf-8"?>
+<a:theme xmlns:a="http://schemas.openxmlformats.org/drawingml/2006/main" xmlns:r="http://schemas.openxmlformats.org/officeDocument/2006/relationships" name="Office">
+  <a:themeElements>
+    <a:clrScheme name="LibreOffice">
+      <a:dk1>
+        <a:srgbClr val="000000"/>
+      </a:dk1>
+      <a:lt1>
+        <a:srgbClr val="FFFFFF"/>
+      </a:lt1>
+      <a:dk2>
+        <a:srgbClr val="000000"/>
+      </a:dk2>
+      <a:lt2>
+        <a:srgbClr val="FFFFFF"/>
+      </a:lt2>
+      <a:accent1>
+        <a:srgbClr val="18A303"/>
+      </a:accent1>
+      <a:accent2>
+        <a:srgbClr val="0369A3"/>
+      </a:accent2>
+      <a:accent3>
+        <a:srgbClr val="A33E03"/>
+      </a:accent3>
+      <a:accent4>
+        <a:srgbClr val="8E03A3"/>
+      </a:accent4>
+      <a:accent5>
+        <a:srgbClr val="C99C00"/>
+      </a:accent5>
+      <a:accent6>
+        <a:srgbClr val="C9211E"/>
+      </a:accent6>
+      <a:hlink>
+        <a:srgbClr val="0000EE"/>
+      </a:hlink>
+      <a:folHlink>
+        <a:srgbClr val="551A8B"/>
+      </a:folHlink>
+    </a:clrScheme>
+    <a:fontScheme name="Office">
+      <a:majorFont>
+        <a:latin typeface="Arial" pitchFamily="0" charset="1"/>
+        <a:ea typeface="DejaVu Sans" pitchFamily="0" charset="1"/>
+        <a:cs typeface="DejaVu Sans" pitchFamily="0" charset="1"/>
+      </a:majorFont>
+      <a:minorFont>
+        <a:latin typeface="Arial" pitchFamily="0" charset="1"/>
+        <a:ea typeface="DejaVu Sans" pitchFamily="0" charset="1"/>
+        <a:cs typeface="DejaVu Sans" pitchFamily="0" charset="1"/>
+      </a:minorFont>
+    </a:fontScheme>
+    <a:fmtScheme>
+      <a:fillStyleLst>
+        <a:solidFill>
+          <a:schemeClr val="phClr"/>
+        </a:solidFill>
+        <a:solidFill>
+          <a:schemeClr val="phClr"/>
+        </a:solidFill>
+        <a:solidFill>
+          <a:schemeClr val="phClr"/>
+        </a:solidFill>
+      </a:fillStyleLst>
+      <a:lnStyleLst>
+        <a:ln w="6350" cap="flat" cmpd="sng" algn="ctr">
+          <a:prstDash val="solid"/>
+          <a:miter/>
+        </a:ln>
+        <a:ln w="6350" cap="flat" cmpd="sng" algn="ctr">
+          <a:prstDash val="solid"/>
+          <a:miter/>
+        </a:ln>
+        <a:ln w="6350" cap="flat" cmpd="sng" algn="ctr">
+          <a:prstDash val="solid"/>
+          <a:miter/>
+        </a:ln>
+      </a:lnStyleLst>
+      <a:effectStyleLst>
+        <a:effectStyle>
+          <a:effectLst/>
+        </a:effectStyle>
+        <a:effectStyle>
+          <a:effectLst/>
+        </a:effectStyle>
+        <a:effectStyle>
+          <a:effectLst/>
+        </a:effectStyle>
+      </a:effectStyleLst>
+      <a:bgFillStyleLst>
+        <a:solidFill>
+          <a:schemeClr val="phClr"/>
+        </a:solidFill>
+        <a:solidFill>
+          <a:schemeClr val="phClr"/>
+        </a:solidFill>
+        <a:solidFill>
+          <a:schemeClr val="phClr"/>
+        </a:solidFill>
+      </a:bgFillStyleLst>
+    </a:fmtScheme>
+  </a:themeElements>
+</a:theme>
 </file>
</xml_diff>